<commit_message>
Publish Mid-Autumn website theme
</commit_message>
<xml_diff>
--- a/docs/网页更新日志.docx
+++ b/docs/网页更新日志.docx
@@ -3290,6 +3290,144 @@
           </w:p>
         </w:tc>
       </w:tr>
+      <w:tr>
+        <w:trPr/>
+        <w:tc>
+          <w:tcPr>
+            <w:tcW w:type="dxa" w:w="1304"/>
+            <w:vAlign w:val="center"/>
+            <w:tcMar>
+              <w:top w:w="110" w:type="dxa"/>
+              <w:start w:w="130" w:type="dxa"/>
+              <w:bottom w:w="110" w:type="dxa"/>
+              <w:end w:w="130" w:type="dxa"/>
+            </w:tcMar>
+          </w:tcPr>
+          <w:p>
+            <w:pPr>
+              <w:spacing w:after="0" w:line="276" w:lineRule="auto"/>
+              <w:jc w:val="center"/>
+            </w:pPr>
+            <w:r/>
+            <w:r>
+              <w:rPr>
+                <w:rFonts w:ascii="Microsoft YaHei" w:hAnsi="Microsoft YaHei" w:eastAsia="Microsoft YaHei"/>
+                <w:color w:val="000000"/>
+                <w:sz w:val="18"/>
+              </w:rPr>
+              <w:t>2026-09-25</w:t>
+            </w:r>
+          </w:p>
+        </w:tc>
+        <w:tc>
+          <w:tcPr>
+            <w:tcW w:type="dxa" w:w="1361"/>
+            <w:vAlign w:val="center"/>
+            <w:tcMar>
+              <w:top w:w="110" w:type="dxa"/>
+              <w:start w:w="130" w:type="dxa"/>
+              <w:bottom w:w="110" w:type="dxa"/>
+              <w:end w:w="130" w:type="dxa"/>
+            </w:tcMar>
+          </w:tcPr>
+          <w:p>
+            <w:pPr>
+              <w:spacing w:after="0" w:line="276" w:lineRule="auto"/>
+              <w:jc w:val="center"/>
+            </w:pPr>
+            <w:r/>
+            <w:r>
+              <w:rPr>
+                <w:rFonts w:ascii="Microsoft YaHei" w:hAnsi="Microsoft YaHei" w:eastAsia="Microsoft YaHei"/>
+                <w:color w:val="000000"/>
+                <w:sz w:val="18"/>
+              </w:rPr>
+              <w:t>GitHub Pages / 中秋更新</w:t>
+            </w:r>
+          </w:p>
+        </w:tc>
+        <w:tc>
+          <w:tcPr>
+            <w:tcW w:type="dxa" w:w="1757"/>
+            <w:vAlign w:val="center"/>
+            <w:tcMar>
+              <w:top w:w="110" w:type="dxa"/>
+              <w:start w:w="130" w:type="dxa"/>
+              <w:bottom w:w="110" w:type="dxa"/>
+              <w:end w:w="130" w:type="dxa"/>
+            </w:tcMar>
+          </w:tcPr>
+          <w:p>
+            <w:pPr>
+              <w:spacing w:after="0" w:line="276" w:lineRule="auto"/>
+              <w:jc w:val="center"/>
+            </w:pPr>
+            <w:r/>
+            <w:r>
+              <w:rPr>
+                <w:rFonts w:ascii="Microsoft YaHei" w:hAnsi="Microsoft YaHei" w:eastAsia="Microsoft YaHei"/>
+                <w:color w:val="000000"/>
+                <w:sz w:val="18"/>
+              </w:rPr>
+              <w:t>上线中秋主题并发布官网首次公开公告</w:t>
+            </w:r>
+          </w:p>
+        </w:tc>
+        <w:tc>
+          <w:tcPr>
+            <w:tcW w:type="dxa" w:w="3969"/>
+            <w:vAlign w:val="center"/>
+            <w:tcMar>
+              <w:top w:w="110" w:type="dxa"/>
+              <w:start w:w="130" w:type="dxa"/>
+              <w:bottom w:w="110" w:type="dxa"/>
+              <w:end w:w="130" w:type="dxa"/>
+            </w:tcMar>
+          </w:tcPr>
+          <w:p>
+            <w:pPr>
+              <w:spacing w:after="0" w:line="276" w:lineRule="auto"/>
+              <w:jc w:val="left"/>
+            </w:pPr>
+            <w:r/>
+            <w:r>
+              <w:rPr>
+                <w:rFonts w:ascii="Microsoft YaHei" w:hAnsi="Microsoft YaHei" w:eastAsia="Microsoft YaHei"/>
+                <w:color w:val="000000"/>
+                <w:sz w:val="18"/>
+              </w:rPr>
+              <w:t>官网首页增加中秋特别开放发布带与月轮光晕；数字档案馆首屏改为月白与桂金主题，加入“从2005年开始的协会记忆，首次通过历届总群公开”提示；修复金星凌日精选海报的公开资源引用；生成QQ群发布文案并复制到网站docs。</w:t>
+            </w:r>
+          </w:p>
+        </w:tc>
+        <w:tc>
+          <w:tcPr>
+            <w:tcW w:type="dxa" w:w="1814"/>
+            <w:vAlign w:val="center"/>
+            <w:tcMar>
+              <w:top w:w="110" w:type="dxa"/>
+              <w:start w:w="130" w:type="dxa"/>
+              <w:bottom w:w="110" w:type="dxa"/>
+              <w:end w:w="130" w:type="dxa"/>
+            </w:tcMar>
+          </w:tcPr>
+          <w:p>
+            <w:pPr>
+              <w:spacing w:after="0" w:line="276" w:lineRule="auto"/>
+              <w:jc w:val="left"/>
+            </w:pPr>
+            <w:r/>
+            <w:r>
+              <w:rPr>
+                <w:rFonts w:ascii="Microsoft YaHei" w:hAnsi="Microsoft YaHei" w:eastAsia="Microsoft YaHei"/>
+                <w:color w:val="000000"/>
+                <w:sz w:val="18"/>
+              </w:rPr>
+              <w:t>桌面端与移动端验证无横向溢出、主题提示可见、图片加载正常、无控制台错误；公开内容继续只包含页面与经筛查的脱敏资源，账号密码、会员名单、联系方式、财务明细、个人证书与内部资料保持隔离。</w:t>
+            </w:r>
+          </w:p>
+        </w:tc>
+      </w:tr>
     </w:tbl>
     <w:p>
       <w:pPr>

</xml_diff>

<commit_message>
Publish weekly astronomy moonwatch notice
</commit_message>
<xml_diff>
--- a/docs/网页更新日志.docx
+++ b/docs/网页更新日志.docx
@@ -3428,6 +3428,144 @@
           </w:p>
         </w:tc>
       </w:tr>
+      <w:tr>
+        <w:trPr/>
+        <w:tc>
+          <w:tcPr>
+            <w:tcW w:type="dxa" w:w="1304"/>
+            <w:vAlign w:val="center"/>
+            <w:tcMar>
+              <w:top w:w="110" w:type="dxa"/>
+              <w:start w:w="130" w:type="dxa"/>
+              <w:bottom w:w="110" w:type="dxa"/>
+              <w:end w:w="130" w:type="dxa"/>
+            </w:tcMar>
+          </w:tcPr>
+          <w:p>
+            <w:pPr>
+              <w:spacing w:after="0" w:line="276" w:lineRule="auto"/>
+              <w:jc w:val="center"/>
+            </w:pPr>
+            <w:r/>
+            <w:r>
+              <w:rPr>
+                <w:rFonts w:ascii="Microsoft YaHei" w:hAnsi="Microsoft YaHei" w:eastAsia="Microsoft YaHei"/>
+                <w:color w:val="000000"/>
+                <w:sz w:val="18"/>
+              </w:rPr>
+              <w:t>2026-09-25</w:t>
+            </w:r>
+          </w:p>
+        </w:tc>
+        <w:tc>
+          <w:tcPr>
+            <w:tcW w:type="dxa" w:w="1361"/>
+            <w:vAlign w:val="center"/>
+            <w:tcMar>
+              <w:top w:w="110" w:type="dxa"/>
+              <w:start w:w="130" w:type="dxa"/>
+              <w:bottom w:w="110" w:type="dxa"/>
+              <w:end w:w="130" w:type="dxa"/>
+            </w:tcMar>
+          </w:tcPr>
+          <w:p>
+            <w:pPr>
+              <w:spacing w:after="0" w:line="276" w:lineRule="auto"/>
+              <w:jc w:val="center"/>
+            </w:pPr>
+            <w:r/>
+            <w:r>
+              <w:rPr>
+                <w:rFonts w:ascii="Microsoft YaHei" w:hAnsi="Microsoft YaHei" w:eastAsia="Microsoft YaHei"/>
+                <w:color w:val="000000"/>
+                <w:sz w:val="18"/>
+              </w:rPr>
+              <w:t>GitHub Pages / 即时活动</w:t>
+            </w:r>
+          </w:p>
+        </w:tc>
+        <w:tc>
+          <w:tcPr>
+            <w:tcW w:type="dxa" w:w="1757"/>
+            <w:vAlign w:val="center"/>
+            <w:tcMar>
+              <w:top w:w="110" w:type="dxa"/>
+              <w:start w:w="130" w:type="dxa"/>
+              <w:bottom w:w="110" w:type="dxa"/>
+              <w:end w:w="130" w:type="dxa"/>
+            </w:tcMar>
+          </w:tcPr>
+          <w:p>
+            <w:pPr>
+              <w:spacing w:after="0" w:line="276" w:lineRule="auto"/>
+              <w:jc w:val="center"/>
+            </w:pPr>
+            <w:r/>
+            <w:r>
+              <w:rPr>
+                <w:rFonts w:ascii="Microsoft YaHei" w:hAnsi="Microsoft YaHei" w:eastAsia="Microsoft YaHei"/>
+                <w:color w:val="000000"/>
+                <w:sz w:val="18"/>
+              </w:rPr>
+              <w:t>发布每周天文与中秋观月现场通知</w:t>
+            </w:r>
+          </w:p>
+        </w:tc>
+        <w:tc>
+          <w:tcPr>
+            <w:tcW w:type="dxa" w:w="3969"/>
+            <w:vAlign w:val="center"/>
+            <w:tcMar>
+              <w:top w:w="110" w:type="dxa"/>
+              <w:start w:w="130" w:type="dxa"/>
+              <w:bottom w:w="110" w:type="dxa"/>
+              <w:end w:w="130" w:type="dxa"/>
+            </w:tcMar>
+          </w:tcPr>
+          <w:p>
+            <w:pPr>
+              <w:spacing w:after="0" w:line="276" w:lineRule="auto"/>
+              <w:jc w:val="left"/>
+            </w:pPr>
+            <w:r/>
+            <w:r>
+              <w:rPr>
+                <w:rFonts w:ascii="Microsoft YaHei" w:hAnsi="Microsoft YaHei" w:eastAsia="Microsoft YaHei"/>
+                <w:color w:val="000000"/>
+                <w:sz w:val="18"/>
+              </w:rPr>
+              <w:t>新增“每周天文”栏目页，发布2026中秋观月特辑；将协会周报图片重新编码为WebP并移除元数据；官网首页增加可点击即时通知，公布今晚21:40在青春广场摆摊观月，并链接至完整周报页面。</w:t>
+            </w:r>
+          </w:p>
+        </w:tc>
+        <w:tc>
+          <w:tcPr>
+            <w:tcW w:type="dxa" w:w="1814"/>
+            <w:vAlign w:val="center"/>
+            <w:tcMar>
+              <w:top w:w="110" w:type="dxa"/>
+              <w:start w:w="130" w:type="dxa"/>
+              <w:bottom w:w="110" w:type="dxa"/>
+              <w:end w:w="130" w:type="dxa"/>
+            </w:tcMar>
+          </w:tcPr>
+          <w:p>
+            <w:pPr>
+              <w:spacing w:after="0" w:line="276" w:lineRule="auto"/>
+              <w:jc w:val="left"/>
+            </w:pPr>
+            <w:r/>
+            <w:r>
+              <w:rPr>
+                <w:rFonts w:ascii="Microsoft YaHei" w:hAnsi="Microsoft YaHei" w:eastAsia="Microsoft YaHei"/>
+                <w:color w:val="000000"/>
+                <w:sz w:val="18"/>
+              </w:rPr>
+              <w:t>图片已检查，未发现账号、联系方式、名单或个人证件信息；桌面端与移动端均验证时间地点显示正确、图片加载正常、无横向溢出、无控制台或网络错误。</w:t>
+            </w:r>
+          </w:p>
+        </w:tc>
+      </w:tr>
     </w:tbl>
     <w:p>
       <w:pPr>

</xml_diff>

<commit_message>
Add public archive entry to homepage
</commit_message>
<xml_diff>
--- a/docs/网页更新日志.docx
+++ b/docs/网页更新日志.docx
@@ -3566,6 +3566,144 @@
           </w:p>
         </w:tc>
       </w:tr>
+      <w:tr>
+        <w:trPr/>
+        <w:tc>
+          <w:tcPr>
+            <w:tcW w:type="dxa" w:w="1304"/>
+            <w:vAlign w:val="center"/>
+            <w:tcMar>
+              <w:top w:w="110" w:type="dxa"/>
+              <w:start w:w="130" w:type="dxa"/>
+              <w:bottom w:w="110" w:type="dxa"/>
+              <w:end w:w="130" w:type="dxa"/>
+            </w:tcMar>
+          </w:tcPr>
+          <w:p>
+            <w:pPr>
+              <w:spacing w:after="0" w:line="276" w:lineRule="auto"/>
+              <w:jc w:val="center"/>
+            </w:pPr>
+            <w:r/>
+            <w:r>
+              <w:rPr>
+                <w:rFonts w:ascii="Microsoft YaHei" w:hAnsi="Microsoft YaHei" w:eastAsia="Microsoft YaHei"/>
+                <w:color w:val="000000"/>
+                <w:sz w:val="18"/>
+              </w:rPr>
+              <w:t>2026-09-25</w:t>
+            </w:r>
+          </w:p>
+        </w:tc>
+        <w:tc>
+          <w:tcPr>
+            <w:tcW w:type="dxa" w:w="1361"/>
+            <w:vAlign w:val="center"/>
+            <w:tcMar>
+              <w:top w:w="110" w:type="dxa"/>
+              <w:start w:w="130" w:type="dxa"/>
+              <w:bottom w:w="110" w:type="dxa"/>
+              <w:end w:w="130" w:type="dxa"/>
+            </w:tcMar>
+          </w:tcPr>
+          <w:p>
+            <w:pPr>
+              <w:spacing w:after="0" w:line="276" w:lineRule="auto"/>
+              <w:jc w:val="center"/>
+            </w:pPr>
+            <w:r/>
+            <w:r>
+              <w:rPr>
+                <w:rFonts w:ascii="Microsoft YaHei" w:hAnsi="Microsoft YaHei" w:eastAsia="Microsoft YaHei"/>
+                <w:color w:val="000000"/>
+                <w:sz w:val="18"/>
+              </w:rPr>
+              <w:t>GitHub Pages / 导航更新</w:t>
+            </w:r>
+          </w:p>
+        </w:tc>
+        <w:tc>
+          <w:tcPr>
+            <w:tcW w:type="dxa" w:w="1757"/>
+            <w:vAlign w:val="center"/>
+            <w:tcMar>
+              <w:top w:w="110" w:type="dxa"/>
+              <w:start w:w="130" w:type="dxa"/>
+              <w:bottom w:w="110" w:type="dxa"/>
+              <w:end w:w="130" w:type="dxa"/>
+            </w:tcMar>
+          </w:tcPr>
+          <w:p>
+            <w:pPr>
+              <w:spacing w:after="0" w:line="276" w:lineRule="auto"/>
+              <w:jc w:val="center"/>
+            </w:pPr>
+            <w:r/>
+            <w:r>
+              <w:rPr>
+                <w:rFonts w:ascii="Microsoft YaHei" w:hAnsi="Microsoft YaHei" w:eastAsia="Microsoft YaHei"/>
+                <w:color w:val="000000"/>
+                <w:sz w:val="18"/>
+              </w:rPr>
+              <w:t>增加数字档案馆公开入口</w:t>
+            </w:r>
+          </w:p>
+        </w:tc>
+        <w:tc>
+          <w:tcPr>
+            <w:tcW w:type="dxa" w:w="3969"/>
+            <w:vAlign w:val="center"/>
+            <w:tcMar>
+              <w:top w:w="110" w:type="dxa"/>
+              <w:start w:w="130" w:type="dxa"/>
+              <w:bottom w:w="110" w:type="dxa"/>
+              <w:end w:w="130" w:type="dxa"/>
+            </w:tcMar>
+          </w:tcPr>
+          <w:p>
+            <w:pPr>
+              <w:spacing w:after="0" w:line="276" w:lineRule="auto"/>
+              <w:jc w:val="left"/>
+            </w:pPr>
+            <w:r/>
+            <w:r>
+              <w:rPr>
+                <w:rFonts w:ascii="Microsoft YaHei" w:hAnsi="Microsoft YaHei" w:eastAsia="Microsoft YaHei"/>
+                <w:color w:val="000000"/>
+                <w:sz w:val="18"/>
+              </w:rPr>
+              <w:t>将首页原有不可点击的档案馆提示改为常驻公开入口，显示“数字档案馆现已公开 / 2005—2026历届资料”，点击后直接进入数字档案馆。入口位于官网最上方，并兼容当前中秋观月即时通知。</w:t>
+            </w:r>
+          </w:p>
+        </w:tc>
+        <w:tc>
+          <w:tcPr>
+            <w:tcW w:type="dxa" w:w="1814"/>
+            <w:vAlign w:val="center"/>
+            <w:tcMar>
+              <w:top w:w="110" w:type="dxa"/>
+              <w:start w:w="130" w:type="dxa"/>
+              <w:bottom w:w="110" w:type="dxa"/>
+              <w:end w:w="130" w:type="dxa"/>
+            </w:tcMar>
+          </w:tcPr>
+          <w:p>
+            <w:pPr>
+              <w:spacing w:after="0" w:line="276" w:lineRule="auto"/>
+              <w:jc w:val="left"/>
+            </w:pPr>
+            <w:r/>
+            <w:r>
+              <w:rPr>
+                <w:rFonts w:ascii="Microsoft YaHei" w:hAnsi="Microsoft YaHei" w:eastAsia="Microsoft YaHei"/>
+                <w:color w:val="000000"/>
+                <w:sz w:val="18"/>
+              </w:rPr>
+              <w:t>桌面端与移动端均验证入口可见、链接目标为/archive/、点击后档案馆标题正确加载；无横向溢出、控制台错误或失败资源。</w:t>
+            </w:r>
+          </w:p>
+        </w:tc>
+      </w:tr>
     </w:tbl>
     <w:p>
       <w:pPr>

</xml_diff>

<commit_message>
Restore regular design and separate archive and weekly columns
</commit_message>
<xml_diff>
--- a/docs/网页更新日志.docx
+++ b/docs/网页更新日志.docx
@@ -3704,6 +3704,144 @@
           </w:p>
         </w:tc>
       </w:tr>
+      <w:tr>
+        <w:trPr/>
+        <w:tc>
+          <w:tcPr>
+            <w:tcW w:type="dxa" w:w="1304"/>
+            <w:vAlign w:val="center"/>
+            <w:tcMar>
+              <w:top w:w="110" w:type="dxa"/>
+              <w:start w:w="130" w:type="dxa"/>
+              <w:bottom w:w="110" w:type="dxa"/>
+              <w:end w:w="130" w:type="dxa"/>
+            </w:tcMar>
+          </w:tcPr>
+          <w:p>
+            <w:pPr>
+              <w:spacing w:after="0" w:line="276" w:lineRule="auto"/>
+              <w:jc w:val="center"/>
+            </w:pPr>
+            <w:r/>
+            <w:r>
+              <w:rPr>
+                <w:rFonts w:ascii="Microsoft YaHei" w:hAnsi="Microsoft YaHei" w:eastAsia="Microsoft YaHei"/>
+                <w:color w:val="000000"/>
+                <w:sz w:val="18"/>
+              </w:rPr>
+              <w:t>2026-10-12</w:t>
+            </w:r>
+          </w:p>
+        </w:tc>
+        <w:tc>
+          <w:tcPr>
+            <w:tcW w:type="dxa" w:w="1361"/>
+            <w:vAlign w:val="center"/>
+            <w:tcMar>
+              <w:top w:w="110" w:type="dxa"/>
+              <w:start w:w="130" w:type="dxa"/>
+              <w:bottom w:w="110" w:type="dxa"/>
+              <w:end w:w="130" w:type="dxa"/>
+            </w:tcMar>
+          </w:tcPr>
+          <w:p>
+            <w:pPr>
+              <w:spacing w:after="0" w:line="276" w:lineRule="auto"/>
+              <w:jc w:val="center"/>
+            </w:pPr>
+            <w:r/>
+            <w:r>
+              <w:rPr>
+                <w:rFonts w:ascii="Microsoft YaHei" w:hAnsi="Microsoft YaHei" w:eastAsia="Microsoft YaHei"/>
+                <w:color w:val="000000"/>
+                <w:sz w:val="18"/>
+              </w:rPr>
+              <w:t>GitHub Pages / 栏目改版</w:t>
+            </w:r>
+          </w:p>
+        </w:tc>
+        <w:tc>
+          <w:tcPr>
+            <w:tcW w:type="dxa" w:w="1757"/>
+            <w:vAlign w:val="center"/>
+            <w:tcMar>
+              <w:top w:w="110" w:type="dxa"/>
+              <w:start w:w="130" w:type="dxa"/>
+              <w:bottom w:w="110" w:type="dxa"/>
+              <w:end w:w="130" w:type="dxa"/>
+            </w:tcMar>
+          </w:tcPr>
+          <w:p>
+            <w:pPr>
+              <w:spacing w:after="0" w:line="276" w:lineRule="auto"/>
+              <w:jc w:val="center"/>
+            </w:pPr>
+            <w:r/>
+            <w:r>
+              <w:rPr>
+                <w:rFonts w:ascii="Microsoft YaHei" w:hAnsi="Microsoft YaHei" w:eastAsia="Microsoft YaHei"/>
+                <w:color w:val="000000"/>
+                <w:sz w:val="18"/>
+              </w:rPr>
+              <w:t>恢复常规官网设计，独立设置档案馆与天文周报</w:t>
+            </w:r>
+          </w:p>
+        </w:tc>
+        <w:tc>
+          <w:tcPr>
+            <w:tcW w:type="dxa" w:w="3969"/>
+            <w:vAlign w:val="center"/>
+            <w:tcMar>
+              <w:top w:w="110" w:type="dxa"/>
+              <w:start w:w="130" w:type="dxa"/>
+              <w:bottom w:w="110" w:type="dxa"/>
+              <w:end w:w="130" w:type="dxa"/>
+            </w:tcMar>
+          </w:tcPr>
+          <w:p>
+            <w:pPr>
+              <w:spacing w:after="0" w:line="276" w:lineRule="auto"/>
+              <w:jc w:val="left"/>
+            </w:pPr>
+            <w:r/>
+            <w:r>
+              <w:rPr>
+                <w:rFonts w:ascii="Microsoft YaHei" w:hAnsi="Microsoft YaHei" w:eastAsia="Microsoft YaHei"/>
+                <w:color w:val="000000"/>
+                <w:sz w:val="18"/>
+              </w:rPr>
+              <w:t>恢复官网原有深色星空及冷蓝色设计，撤下中秋主题与过期即时通知。数字档案馆、天文周报加入桌面和手机常驻导航；统一19个历届档案专题的栏目导航，保留既有整理内容与图片。天文周报改为独立期刊列表，2026年9月25日中秋观月特辑迁入独立详情页，原观月通知明确标为已结束。</w:t>
+            </w:r>
+          </w:p>
+        </w:tc>
+        <w:tc>
+          <w:tcPr>
+            <w:tcW w:type="dxa" w:w="1814"/>
+            <w:vAlign w:val="center"/>
+            <w:tcMar>
+              <w:top w:w="110" w:type="dxa"/>
+              <w:start w:w="130" w:type="dxa"/>
+              <w:bottom w:w="110" w:type="dxa"/>
+              <w:end w:w="130" w:type="dxa"/>
+            </w:tcMar>
+          </w:tcPr>
+          <w:p>
+            <w:pPr>
+              <w:spacing w:after="0" w:line="276" w:lineRule="auto"/>
+              <w:jc w:val="left"/>
+            </w:pPr>
+            <w:r/>
+            <w:r>
+              <w:rPr>
+                <w:rFonts w:ascii="Microsoft YaHei" w:hAnsi="Microsoft YaHei" w:eastAsia="Microsoft YaHei"/>
+                <w:color w:val="000000"/>
+                <w:sz w:val="18"/>
+              </w:rPr>
+              <w:t>首页、档案馆、周报列表及详情页通过1440、1024、390像素视口交互检查；19个历届专题通过桌面和手机导航检查。确认栏目可点击、周报原图正常加载、无横向溢出、无控制台错误或失败资源；Next.js页面切换后导航保持有效。网页更新日志同步复制到网站docs目录。</w:t>
+            </w:r>
+          </w:p>
+        </w:tc>
+      </w:tr>
     </w:tbl>
     <w:p>
       <w:pPr>

</xml_diff>

<commit_message>
Publish 2026 autumn recruitment with D4 booth information
</commit_message>
<xml_diff>
--- a/docs/网页更新日志.docx
+++ b/docs/网页更新日志.docx
@@ -3842,6 +3842,144 @@
           </w:p>
         </w:tc>
       </w:tr>
+      <w:tr>
+        <w:trPr/>
+        <w:tc>
+          <w:tcPr>
+            <w:tcW w:type="dxa" w:w="1304"/>
+            <w:vAlign w:val="center"/>
+            <w:tcMar>
+              <w:top w:w="110" w:type="dxa"/>
+              <w:start w:w="130" w:type="dxa"/>
+              <w:bottom w:w="110" w:type="dxa"/>
+              <w:end w:w="130" w:type="dxa"/>
+            </w:tcMar>
+          </w:tcPr>
+          <w:p>
+            <w:pPr>
+              <w:spacing w:after="0" w:line="276" w:lineRule="auto"/>
+              <w:jc w:val="center"/>
+            </w:pPr>
+            <w:r/>
+            <w:r>
+              <w:rPr>
+                <w:rFonts w:ascii="Microsoft YaHei" w:hAnsi="Microsoft YaHei" w:eastAsia="Microsoft YaHei"/>
+                <w:color w:val="000000"/>
+                <w:sz w:val="18"/>
+              </w:rPr>
+              <w:t>2026-10-12</w:t>
+            </w:r>
+          </w:p>
+        </w:tc>
+        <w:tc>
+          <w:tcPr>
+            <w:tcW w:type="dxa" w:w="1361"/>
+            <w:vAlign w:val="center"/>
+            <w:tcMar>
+              <w:top w:w="110" w:type="dxa"/>
+              <w:start w:w="130" w:type="dxa"/>
+              <w:bottom w:w="110" w:type="dxa"/>
+              <w:end w:w="130" w:type="dxa"/>
+            </w:tcMar>
+          </w:tcPr>
+          <w:p>
+            <w:pPr>
+              <w:spacing w:after="0" w:line="276" w:lineRule="auto"/>
+              <w:jc w:val="center"/>
+            </w:pPr>
+            <w:r/>
+            <w:r>
+              <w:rPr>
+                <w:rFonts w:ascii="Microsoft YaHei" w:hAnsi="Microsoft YaHei" w:eastAsia="Microsoft YaHei"/>
+                <w:color w:val="000000"/>
+                <w:sz w:val="18"/>
+              </w:rPr>
+              <w:t>GitHub Pages / 秋季招新</w:t>
+            </w:r>
+          </w:p>
+        </w:tc>
+        <w:tc>
+          <w:tcPr>
+            <w:tcW w:type="dxa" w:w="1757"/>
+            <w:vAlign w:val="center"/>
+            <w:tcMar>
+              <w:top w:w="110" w:type="dxa"/>
+              <w:start w:w="130" w:type="dxa"/>
+              <w:bottom w:w="110" w:type="dxa"/>
+              <w:end w:w="130" w:type="dxa"/>
+            </w:tcMar>
+          </w:tcPr>
+          <w:p>
+            <w:pPr>
+              <w:spacing w:after="0" w:line="276" w:lineRule="auto"/>
+              <w:jc w:val="center"/>
+            </w:pPr>
+            <w:r/>
+            <w:r>
+              <w:rPr>
+                <w:rFonts w:ascii="Microsoft YaHei" w:hAnsi="Microsoft YaHei" w:eastAsia="Microsoft YaHei"/>
+                <w:color w:val="000000"/>
+                <w:sz w:val="18"/>
+              </w:rPr>
+              <w:t>发布2026秋季招新信息并确认D4摊位</w:t>
+            </w:r>
+          </w:p>
+        </w:tc>
+        <w:tc>
+          <w:tcPr>
+            <w:tcW w:type="dxa" w:w="3969"/>
+            <w:vAlign w:val="center"/>
+            <w:tcMar>
+              <w:top w:w="110" w:type="dxa"/>
+              <w:start w:w="130" w:type="dxa"/>
+              <w:bottom w:w="110" w:type="dxa"/>
+              <w:end w:w="130" w:type="dxa"/>
+            </w:tcMar>
+          </w:tcPr>
+          <w:p>
+            <w:pPr>
+              <w:spacing w:after="0" w:line="276" w:lineRule="auto"/>
+              <w:jc w:val="left"/>
+            </w:pPr>
+            <w:r/>
+            <w:r>
+              <w:rPr>
+                <w:rFonts w:ascii="Microsoft YaHei" w:hAnsi="Microsoft YaHei" w:eastAsia="Microsoft YaHei"/>
+                <w:color w:val="000000"/>
+                <w:sz w:val="18"/>
+              </w:rPr>
+              <w:t>在加入我们页面发布2026年秋季招新信息，日期为10月16日，摊位根据用户确认填写为青春广场D4。根据提供海报整理四个部门、主要活动、会员入群和干事报名面试说明，公开会员迎新群854298753及报名海报。提供两张海报的轻量预览与清晰大图，重新编码并移除元数据；暂不发布仍含000号占位的封面。保留原有官网导航与安全说明。</w:t>
+            </w:r>
+          </w:p>
+        </w:tc>
+        <w:tc>
+          <w:tcPr>
+            <w:tcW w:type="dxa" w:w="1814"/>
+            <w:vAlign w:val="center"/>
+            <w:tcMar>
+              <w:top w:w="110" w:type="dxa"/>
+              <w:start w:w="130" w:type="dxa"/>
+              <w:bottom w:w="110" w:type="dxa"/>
+              <w:end w:w="130" w:type="dxa"/>
+            </w:tcMar>
+          </w:tcPr>
+          <w:p>
+            <w:pPr>
+              <w:spacing w:after="0" w:line="276" w:lineRule="auto"/>
+              <w:jc w:val="left"/>
+            </w:pPr>
+            <w:r/>
+            <w:r>
+              <w:rPr>
+                <w:rFonts w:ascii="Microsoft YaHei" w:hAnsi="Microsoft YaHei" w:eastAsia="Microsoft YaHei"/>
+                <w:color w:val="000000"/>
+                <w:sz w:val="18"/>
+              </w:rPr>
+              <w:t>加入我们页面及从首页进入的客户端跳转通过1440、1024、390、320像素视口检查；验证日期、D4摊位、四个部门、报名锚点与海报资源，无横向溢出、控制台错误或失败资源。同步更新静态HTML与Next.js页面数据，避免客户端跳转出现旧内容。网页更新日志复制到网站docs目录。</w:t>
+            </w:r>
+          </w:p>
+        </w:tc>
+      </w:tr>
     </w:tbl>
     <w:p>
       <w:pPr>

</xml_diff>